<commit_message>
chore: plan experiment report code-change section
</commit_message>
<xml_diff>
--- a/实验4/outputs/实验4行为型设计模式分析与应用-完成版.docx
+++ b/实验4/outputs/实验4行为型设计模式分析与应用-完成版.docx
@@ -2071,7 +2071,7 @@
           </w:tcPr>
           <w:p>
             <w:r>
-              <w:t>0.9142</w:t>
+              <w:t>0.9226</w:t>
             </w:r>
           </w:p>
         </w:tc>
@@ -2081,7 +2081,7 @@
           </w:tcPr>
           <w:p>
             <w:r>
-              <w:t>0.9540</w:t>
+              <w:t>0.9585</w:t>
             </w:r>
           </w:p>
         </w:tc>

</xml_diff>

<commit_message>
fix: show readable file paths in report diff section
</commit_message>
<xml_diff>
--- a/实验4/outputs/实验4行为型设计模式分析与应用-完成版.docx
+++ b/实验4/outputs/实验4行为型设计模式分析与应用-完成版.docx
@@ -2361,6 +2361,451 @@
     </w:p>
     <w:p>
       <w:pPr>
+        <w:pStyle w:val="Heading2"/>
+      </w:pPr>
+      <w:r>
+        <w:t>5. 代码新增与删减体现</w:t>
+      </w:r>
+    </w:p>
+    <w:p>
+      <w:r>
+        <w:t>以下内容直接摘录自当前实验4源码相对基线版本的实际差异，用于体现新增与删减位置。</w:t>
+      </w:r>
+    </w:p>
+    <w:p>
+      <w:r>
+        <w:t>文件：\345\256\236\351\252\2144/lab4/analysis.py</w:t>
+      </w:r>
+    </w:p>
+    <w:p>
+      <w:r>
+        <w:rPr>
+          <w:rFonts w:ascii="Courier New" w:hAnsi="Courier New"/>
+          <w:sz w:val="17"/>
+        </w:rPr>
+        <w:t>@@ -75 +74,0 @@ class DataPreparationTask(AnalysisTask):</w:t>
+        <w:br/>
+        <w:t>-        process_long.to_csv(paths.output_dir / "process_long_records.csv", index=False, encoding="utf-8-sig")</w:t>
+      </w:r>
+    </w:p>
+    <w:p>
+      <w:r>
+        <w:rPr>
+          <w:rFonts w:ascii="Courier New" w:hAnsi="Courier New"/>
+          <w:sz w:val="17"/>
+        </w:rPr>
+        <w:t>@@ -78 +76,0 @@ class DataPreparationTask(AnalysisTask):</w:t>
+        <w:br/>
+        <w:t>-        quality_enriched.to_csv(paths.output_dir / "quality_enriched_records.csv", index=False, encoding="utf-8-sig")</w:t>
+      </w:r>
+    </w:p>
+    <w:p>
+      <w:r>
+        <w:rPr>
+          <w:rFonts w:ascii="Courier New" w:hAnsi="Courier New"/>
+          <w:sz w:val="17"/>
+        </w:rPr>
+        <w:t>@@ -140 +138,37 @@ class ValidationAndSummaryTask(AnalysisTask):</w:t>
+        <w:br/>
+        <w:t>-        quality.to_csv(paths.output_dir / "quality_validation_results.csv", index=False, encoding="utf-8-sig")</w:t>
+        <w:br/>
+        <w:t>+        field_summary = (</w:t>
+        <w:br/>
+        <w:t>+            quality.groupby(["检查项目", "field_type"], dropna=False)</w:t>
+        <w:br/>
+        <w:t>+            .agg(</w:t>
+        <w:br/>
+        <w:t>+                样本数=("工单号", "size"),</w:t>
+        <w:br/>
+        <w:t>+                可判断数=("actual_pass", lambda series: series.notna().sum()),</w:t>
+        <w:br/>
+        <w:t>+                一致数=("isok_matches_validation", lambda series: (series == True).sum()),</w:t>
+        <w:br/>
+        <w:t>+                不一致数=("isok_matches_validation", lambda series: (series == False).sum()),</w:t>
+        <w:br/>
+        <w:t>+            )</w:t>
+        <w:br/>
+        <w:t>+            .reset_index()</w:t>
+        <w:br/>
+        <w:t>+        )</w:t>
+        <w:br/>
+        <w:t>+        field_summary["一致率"] = field_summary.apply(</w:t>
+        <w:br/>
+        <w:t>+            lambda row: safe_divide(row["一致数"], row["可判断数"]),</w:t>
+        <w:br/>
+        <w:t>+            axis=1,</w:t>
+        <w:br/>
+        <w:t>+        )</w:t>
+        <w:br/>
+        <w:t>+        mismatch_detail = quality.loc[</w:t>
+        <w:br/>
+        <w:t>+            quality["isok_matches_validation"] == False,</w:t>
+        <w:br/>
+        <w:t>+            [</w:t>
+        <w:br/>
+        <w:t>+                "批号",</w:t>
+        <w:br/>
+        <w:t>+                "工单号",</w:t>
+        <w:br/>
+        <w:t>+                "物料品名",</w:t>
+        <w:br/>
+        <w:t>+                "检查项目",</w:t>
+        <w:br/>
+        <w:t>+                "field_type",</w:t>
+        <w:br/>
+        <w:t>+                "标准参数",</w:t>
+        <w:br/>
+        <w:t>+                "检验参数(标准参数为数字时无需填写)",</w:t>
+        <w:br/>
+        <w:t>+                "检验值",</w:t>
+        <w:br/>
+        <w:t>+                "numeric_value",</w:t>
+        <w:br/>
+        <w:t>+                "lower_bound",</w:t>
+        <w:br/>
+        <w:t>+                "upper_bound",</w:t>
+        <w:br/>
+        <w:t>+                "expected_text",</w:t>
+        <w:br/>
+        <w:t>+                "IsOK",</w:t>
+        <w:br/>
+        <w:t>+                "actual_pass",</w:t>
+        <w:br/>
+        <w:t>+                "rule_source",</w:t>
+        <w:br/>
+        <w:t>+            ],</w:t>
+        <w:br/>
+        <w:t>+        ].copy()</w:t>
+        <w:br/>
+        <w:t>+</w:t>
+        <w:br/>
+        <w:t>+        field_summary.to_csv(paths.output_dir / "quality_validation_field_summary.csv", index=False, encoding="utf-8-sig")</w:t>
+        <w:br/>
+        <w:t>+        mismatch_detail.to_csv(paths.output_dir / "quality_validation_mismatches.csv", index=False, encoding="utf-8-sig")</w:t>
+      </w:r>
+    </w:p>
+    <w:p>
+      <w:r>
+        <w:rPr>
+          <w:rFonts w:ascii="Courier New" w:hAnsi="Courier New"/>
+          <w:sz w:val="17"/>
+        </w:rPr>
+        <w:t>@@ -147,0 +182,2 @@ class ValidationAndSummaryTask(AnalysisTask):</w:t>
+        <w:br/>
+        <w:t>+            validation_field_summary=field_summary,</w:t>
+        <w:br/>
+        <w:t>+            validation_mismatch_detail=mismatch_detail,</w:t>
+      </w:r>
+    </w:p>
+    <w:p>
+      <w:r>
+        <w:rPr>
+          <w:rFonts w:ascii="Courier New" w:hAnsi="Courier New"/>
+          <w:sz w:val="17"/>
+        </w:rPr>
+        <w:t>@@ -198 +234 @@ class CorrelationAnalysisTask(AnalysisTask):</w:t>
+        <w:br/>
+        <w:t>-        matrix_display = matrix_numeric.applymap(format_correlation)</w:t>
+        <w:br/>
+        <w:t>+        matrix_display = matrix_numeric.apply(lambda column: column.map(format_correlation))</w:t>
+      </w:r>
+    </w:p>
+    <w:p>
+      <w:r>
+        <w:rPr>
+          <w:rFonts w:ascii="Courier New" w:hAnsi="Courier New"/>
+          <w:sz w:val="17"/>
+        </w:rPr>
+        <w:t>@@ -248 +284,6 @@ class RegressionTask(AnalysisTask):</w:t>
+        <w:br/>
+        <w:t>-        candidate_fields = context.data["top_correlation_fields"][:TOP_REGRESSION_FIELDS]</w:t>
+        <w:br/>
+        <w:t>+        candidate_fields = (</w:t>
+        <w:br/>
+        <w:t>+            context.data["correlation_detail"]</w:t>
+        <w:br/>
+        <w:t>+            .loc[lambda frame: frame["样本数"] &gt;= 200, "检查项目"]</w:t>
+        <w:br/>
+        <w:t>+            .head(TOP_REGRESSION_FIELDS)</w:t>
+        <w:br/>
+        <w:t>+            .tolist()</w:t>
+        <w:br/>
+        <w:t>+        )</w:t>
+      </w:r>
+    </w:p>
+    <w:p>
+      <w:r>
+        <w:rPr>
+          <w:rFonts w:ascii="Courier New" w:hAnsi="Courier New"/>
+          <w:sz w:val="17"/>
+        </w:rPr>
+        <w:t>@@ -307,0 +349,11 @@ class RegressionTask(AnalysisTask):</w:t>
+        <w:br/>
+        <w:t>+            valid_mask = meta_test["actual_pass"].notna()</w:t>
+        <w:br/>
+        <w:t>+            if valid_mask.any():</w:t>
+        <w:br/>
+        <w:t>+                actual_labels = meta_test.loc[valid_mask, "actual_pass"].astype(bool).to_numpy()</w:t>
+        <w:br/>
+        <w:t>+                predicted_labels = np.asarray(predicted_pass, dtype=bool)[valid_mask.to_numpy()]</w:t>
+        <w:br/>
+        <w:t>+                precision = precision_score(actual_labels, predicted_labels, zero_division=0)</w:t>
+        <w:br/>
+        <w:t>+                recall = recall_score(actual_labels, predicted_labels, zero_division=0)</w:t>
+        <w:br/>
+        <w:t>+                f1_value = f1_score(actual_labels, predicted_labels, zero_division=0)</w:t>
+        <w:br/>
+        <w:t>+            else:</w:t>
+        <w:br/>
+        <w:t>+                precision = np.nan</w:t>
+        <w:br/>
+        <w:t>+                recall = np.nan</w:t>
+        <w:br/>
+        <w:t>+                f1_value = np.nan</w:t>
+      </w:r>
+    </w:p>
+    <w:p>
+      <w:r>
+        <w:rPr>
+          <w:rFonts w:ascii="Courier New" w:hAnsi="Courier New"/>
+          <w:sz w:val="17"/>
+        </w:rPr>
+        <w:t>@@ -317,3 +369,3 @@ class RegressionTask(AnalysisTask):</w:t>
+        <w:br/>
+        <w:t>-                    "Precision": precision_score(meta_test["actual_pass"], predicted_pass, zero_division=0),</w:t>
+        <w:br/>
+        <w:t>-                    "Recall": recall_score(meta_test["actual_pass"], predicted_pass, zero_division=0),</w:t>
+        <w:br/>
+        <w:t>-                    "F1": f1_score(meta_test["actual_pass"], predicted_pass, zero_division=0),</w:t>
+        <w:br/>
+        <w:t>+                    "Precision": precision,</w:t>
+        <w:br/>
+        <w:t>+                    "Recall": recall,</w:t>
+        <w:br/>
+        <w:t>+                    "F1": f1_value,</w:t>
+      </w:r>
+    </w:p>
+    <w:p>
+      <w:r>
+        <w:t>文件：\345\256\236\351\252\2144/lab4/config.py</w:t>
+      </w:r>
+    </w:p>
+    <w:p>
+      <w:r>
+        <w:rPr>
+          <w:rFonts w:ascii="Courier New" w:hAnsi="Courier New"/>
+          <w:sz w:val="17"/>
+        </w:rPr>
+        <w:t>@@ -20 +20 @@ TOP_REGRESSION_FIELDS = 5</w:t>
+        <w:br/>
+        <w:t>-CORRELATION_MIN_SAMPLES = 120</w:t>
+        <w:br/>
+        <w:t>+CORRELATION_MIN_SAMPLES = 200</w:t>
+      </w:r>
+    </w:p>
+    <w:p>
+      <w:r>
+        <w:t>文件：\345\256\236\351\252\2144/lab4/reporting.py</w:t>
+      </w:r>
+    </w:p>
+    <w:p>
+      <w:r>
+        <w:rPr>
+          <w:rFonts w:ascii="Courier New" w:hAnsi="Courier New"/>
+          <w:sz w:val="17"/>
+        </w:rPr>
+        <w:t>@@ -2,0 +3 @@ from __future__ import annotations</w:t>
+        <w:br/>
+        <w:t>+import subprocess</w:t>
+      </w:r>
+    </w:p>
+    <w:p>
+      <w:r>
+        <w:rPr>
+          <w:rFonts w:ascii="Courier New" w:hAnsi="Courier New"/>
+          <w:sz w:val="17"/>
+        </w:rPr>
+        <w:t>@@ -10 +11 @@ from docx.enum.text import WD_ALIGN_PARAGRAPH</w:t>
+        <w:br/>
+        <w:t>-from docx.shared import Inches</w:t>
+        <w:br/>
+        <w:t>+from docx.shared import Inches, Pt</w:t>
+      </w:r>
+    </w:p>
+    <w:p>
+      <w:r>
+        <w:rPr>
+          <w:rFonts w:ascii="Courier New" w:hAnsi="Courier New"/>
+          <w:sz w:val="17"/>
+        </w:rPr>
+        <w:t>@@ -135,0 +137 @@ def add_results_section(document: Document, context: AnalysisContext, figure_pat</w:t>
+        <w:br/>
+        <w:t>+    add_code_change_section(document, context)</w:t>
+      </w:r>
+    </w:p>
+    <w:p>
+      <w:r>
+        <w:rPr>
+          <w:rFonts w:ascii="Courier New" w:hAnsi="Courier New"/>
+          <w:sz w:val="17"/>
+        </w:rPr>
+        <w:t>@@ -167,0 +170,101 @@ def write_dataframe_table(document: Document, frame: pd.DataFrame, max_rows: int</w:t>
+        <w:br/>
+        <w:t>+def add_code_change_section(document: Document, context: AnalysisContext) -&gt; None:</w:t>
+        <w:br/>
+        <w:t>+    document.add_heading("5. 代码新增与删减体现", level=2)</w:t>
+        <w:br/>
+        <w:t>+    document.add_paragraph("以下内容直接摘录自当前实验4源码相对基线版本的实际差异，用于体现新增与删减位置。")</w:t>
+        <w:br/>
+        <w:t>+    changes = collect_code_changes(context)</w:t>
+        <w:br/>
+        <w:t>+    if not changes:</w:t>
+        <w:br/>
+        <w:t>+        document.add_paragraph("当前未检测到可展示的源码新增或删减。")</w:t>
+        <w:br/>
+        <w:t>+        return</w:t>
+        <w:br/>
+        <w:t>+</w:t>
+        <w:br/>
+        <w:t>+    for relative_path, hunks in changes:</w:t>
+        <w:br/>
+        <w:t>+        document.add_paragraph(f"文件：{relative_path}")</w:t>
+        <w:br/>
+        <w:t>+        for header, lines in hunks:</w:t>
+        <w:br/>
+        <w:t>+            run = document.add_paragraph().add_run(f"{header}\n" + "\n".join(lines))</w:t>
+        <w:br/>
+        <w:t>+            run.font.name = "Courier New"</w:t>
+        <w:br/>
+        <w:t>+            run.font.size = Pt(8.5)</w:t>
+        <w:br/>
+        <w:t>+</w:t>
+        <w:br/>
+        <w:t>+</w:t>
+        <w:br/>
+        <w:t>+def collect_code_changes(context: AnalysisContext) -&gt; list[tuple[str, list[tuple[str, list[str]]]]]:</w:t>
+        <w:br/>
+        <w:t>+    repo_root = context.paths.data_dir.parent</w:t>
+        <w:br/>
+        <w:t>+    targets = [</w:t>
+        <w:br/>
+        <w:t>+        str((context.paths.data_dir / "lab4").relative_to(repo_root)),</w:t>
+        <w:br/>
+        <w:t>+        str((context.paths.data_dir / "run_analysis.py").relative_to(repo_root)),</w:t>
+        <w:br/>
+        <w:t>+    ]</w:t>
+        <w:br/>
+        <w:t>+    baseline = find_baseline_commit(repo_root, targets)</w:t>
+        <w:br/>
+        <w:t>+    if not baseline:</w:t>
+        <w:br/>
+        <w:t>+        return []</w:t>
+        <w:br/>
+        <w:t>+</w:t>
+        <w:br/>
+        <w:t>+    diff_result = subprocess.run(</w:t>
+        <w:br/>
+        <w:t>+        ["git", "-C", str(repo_root), "diff", "--unified=0", "--no-color", baseline, "--", *targets],</w:t>
+        <w:br/>
+        <w:t>+        capture_output=True,</w:t>
+        <w:br/>
+        <w:t>+        text=True,</w:t>
+        <w:br/>
+        <w:t>+        check=False,</w:t>
+        <w:br/>
+        <w:t>+    )</w:t>
+        <w:br/>
+        <w:t>+    if diff_result.returncode not in {0, 1} or not diff_result.stdout.strip():</w:t>
+        <w:br/>
+        <w:t>+        return []</w:t>
+        <w:br/>
+        <w:t>+    return parse_code_change_diff(diff_result.stdout)</w:t>
+        <w:br/>
+        <w:t>+</w:t>
+        <w:br/>
+        <w:t>+</w:t>
+        <w:br/>
+        <w:t>+def find_baseline_commit(repo_root: Path, targets: list[str]) -&gt; str:</w:t>
+        <w:br/>
+        <w:t>+    revision_result = subprocess.run(</w:t>
+        <w:br/>
+        <w:t>+        ["git", "-C", str(repo_root), "rev-list", "--reverse", "HEAD", "--", *targets],</w:t>
+        <w:br/>
+        <w:t>+        capture_output=True,</w:t>
+        <w:br/>
+        <w:t>+        text=True,</w:t>
+        <w:br/>
+        <w:t>+        check=False,</w:t>
+        <w:br/>
+        <w:t>+    )</w:t>
+        <w:br/>
+        <w:t>+    if revision_result.returncode != 0:</w:t>
+        <w:br/>
+        <w:t>+        return ""</w:t>
+        <w:br/>
+        <w:t>+    revisions = [line.strip() for line in revision_result.stdout.splitlines() if line.strip()]</w:t>
+        <w:br/>
+        <w:t>+    return revisions[0] if revisions else ""</w:t>
+        <w:br/>
+        <w:t>+</w:t>
+        <w:br/>
+        <w:t>+</w:t>
+        <w:br/>
+        <w:t>+def parse_code_change_diff(diff_text: str) -&gt; list[tuple[str, list[tuple[str, list[str]]]]]:</w:t>
+        <w:br/>
+        <w:t>+    max_files = 6</w:t>
+        <w:br/>
+        <w:t>+    max_lines_per_file = 80</w:t>
+        <w:br/>
+        <w:t>+    changes: list[tuple[str, list[tuple[str, list[str]]]]] = []</w:t>
+        <w:br/>
+        <w:t>+    current_path = ""</w:t>
+        <w:br/>
+        <w:t>+    current_hunks: list[tuple[str, list[str]]] = []</w:t>
+        <w:br/>
+        <w:t>+    current_header = ""</w:t>
+        <w:br/>
+        <w:t>+    current_lines: list[str] = []</w:t>
+        <w:br/>
+        <w:t>+    line_count = 0</w:t>
+        <w:br/>
+        <w:t>+</w:t>
+        <w:br/>
+        <w:t>+    def flush_hunk() -&gt; None:</w:t>
+        <w:br/>
+        <w:t>+        nonlocal current_header, current_lines</w:t>
+        <w:br/>
+        <w:t>+        if current_header and current_lines:</w:t>
+        <w:br/>
+        <w:t>+            current_hunks.append((current_header, current_lines))</w:t>
+        <w:br/>
+        <w:t>+        current_header = ""</w:t>
+        <w:br/>
+        <w:t>+        current_lines = []</w:t>
+        <w:br/>
+        <w:t>+</w:t>
+        <w:br/>
+        <w:t>+    def flush_file() -&gt; None:</w:t>
+        <w:br/>
+        <w:t>+        nonlocal current_path, current_hunks, line_count</w:t>
+        <w:br/>
+        <w:t>+        flush_hunk()</w:t>
+        <w:br/>
+        <w:t>+        if current_path and current_hunks and len(changes) &lt; max_files:</w:t>
+        <w:br/>
+        <w:t>+            changes.append((current_path, current_hunks))</w:t>
+        <w:br/>
+        <w:t>+        current_path = ""</w:t>
+        <w:br/>
+        <w:t>+        current_hunks = []</w:t>
+        <w:br/>
+        <w:t>+        line_count = 0</w:t>
+        <w:br/>
+        <w:t>+</w:t>
+      </w:r>
+    </w:p>
+    <w:p>
+      <w:pPr>
         <w:pStyle w:val="Heading1"/>
       </w:pPr>
       <w:r>

</xml_diff>

<commit_message>
chore: regenerate experiment4 report outputs
</commit_message>
<xml_diff>
--- a/实验4/outputs/实验4行为型设计模式分析与应用-完成版.docx
+++ b/实验4/outputs/实验4行为型设计模式分析与应用-完成版.docx
@@ -2071,7 +2071,7 @@
           </w:tcPr>
           <w:p>
             <w:r>
-              <w:t>0.9226</w:t>
+              <w:t>0.9276</w:t>
             </w:r>
           </w:p>
         </w:tc>
@@ -2081,7 +2081,7 @@
           </w:tcPr>
           <w:p>
             <w:r>
-              <w:t>0.9585</w:t>
+              <w:t>0.9612</w:t>
             </w:r>
           </w:p>
         </w:tc>
@@ -2374,7 +2374,7 @@
     </w:p>
     <w:p>
       <w:r>
-        <w:t>文件：\345\256\236\351\252\2144/lab4/analysis.py</w:t>
+        <w:t>文件：实验4/lab4/analysis.py</w:t>
       </w:r>
     </w:p>
     <w:p>
@@ -2587,7 +2587,7 @@
     </w:p>
     <w:p>
       <w:r>
-        <w:t>文件：\345\256\236\351\252\2144/lab4/config.py</w:t>
+        <w:t>文件：实验4/lab4/config.py</w:t>
       </w:r>
     </w:p>
     <w:p>
@@ -2605,7 +2605,7 @@
     </w:p>
     <w:p>
       <w:r>
-        <w:t>文件：\345\256\236\351\252\2144/lab4/reporting.py</w:t>
+        <w:t>文件：实验4/lab4/reporting.py</w:t>
       </w:r>
     </w:p>
     <w:p>
@@ -2705,7 +2705,7 @@
         <w:br/>
         <w:t>+    diff_result = subprocess.run(</w:t>
         <w:br/>
-        <w:t>+        ["git", "-C", str(repo_root), "diff", "--unified=0", "--no-color", baseline, "--", *targets],</w:t>
+        <w:t>+        ["git", "-c", "core.quotepath=false", "-C", str(repo_root), "diff", "--unified=0", "--no-color", baseline, "--", *targets],</w:t>
         <w:br/>
         <w:t>+        capture_output=True,</w:t>
         <w:br/>

</xml_diff>